<commit_message>
bap9 reply-brief docx: Times New Roman (the typst face) via docx/reference.xml, XML-identical to the old builder's output with the font changed; TOC and TOA page numbers with dot leaders from fb render's multi-pass engine (FRBP 8014(a)(2)-(3)); certificate names Times New Roman; check.sh --engine docx 16 passed 0 failed (fb-595.63)
</commit_message>
<xml_diff>
--- a/courts/ninth-circuit/bankruptcy-appellate-panel/reply-brief/usage/OUTPUT-reply-brief-2.docx
+++ b/courts/ninth-circuit/bankruptcy-appellate-panel/reply-brief/usage/OUTPUT-reply-brief-2.docx
@@ -165,61 +165,87 @@
     </w:p>
     <w:p>
       <w:pPr>
-        <w:pStyle w:val="Single"/>
-      </w:pPr>
-      <w:r>
-        <w:fldChar w:fldCharType="begin"/>
-      </w:r>
-      <w:r>
-        <w:instrText xml:space="preserve"> TOC \o "1-2" \h \z \u </w:instrText>
-      </w:r>
-      <w:r>
-        <w:fldChar w:fldCharType="separate"/>
-      </w:r>
-    </w:p>
-    <w:p>
-      <w:pPr>
-        <w:pStyle w:val="Single"/>
+        <w:pStyle w:val="TOCEntry1"/>
       </w:pPr>
       <w:r>
         <w:t xml:space="preserve">Argument</w:t>
       </w:r>
-    </w:p>
-    <w:p>
-      <w:pPr>
-        <w:pStyle w:val="TOCLevel2"/>
+      <w:r>
+        <w:t xml:space="preserve"> </w:t>
+      </w:r>
+      <w:r>
+        <w:tab/>
+      </w:r>
+      <w:r>
+        <w:t xml:space="preserve">1</w:t>
+      </w:r>
+    </w:p>
+    <w:p>
+      <w:pPr>
+        <w:pStyle w:val="TOCEntry2"/>
       </w:pPr>
       <w:r>
         <w:t xml:space="preserve">I. The Appellee Does Not Answer the Consideration Argument</w:t>
       </w:r>
-    </w:p>
-    <w:p>
-      <w:pPr>
-        <w:pStyle w:val="TOCLevel2"/>
+      <w:r>
+        <w:t xml:space="preserve"> </w:t>
+      </w:r>
+      <w:r>
+        <w:tab/>
+      </w:r>
+      <w:r>
+        <w:t xml:space="preserve">1</w:t>
+      </w:r>
+    </w:p>
+    <w:p>
+      <w:pPr>
+        <w:pStyle w:val="TOCEntry2"/>
       </w:pPr>
       <w:r>
         <w:t xml:space="preserve">II. The Solvency Argument Does Not Depend on the Schedules</w:t>
       </w:r>
-    </w:p>
-    <w:p>
-      <w:pPr>
-        <w:pStyle w:val="TOCLevel2"/>
+      <w:r>
+        <w:t xml:space="preserve"> </w:t>
+      </w:r>
+      <w:r>
+        <w:tab/>
+      </w:r>
+      <w:r>
+        <w:t xml:space="preserve">1</w:t>
+      </w:r>
+    </w:p>
+    <w:p>
+      <w:pPr>
+        <w:pStyle w:val="TOCEntry2"/>
       </w:pPr>
       <w:r>
         <w:t xml:space="preserve">III. The Section 544 Discussion Is Not Harmless</w:t>
       </w:r>
-    </w:p>
-    <w:p>
-      <w:pPr>
-        <w:pStyle w:val="Single"/>
+      <w:r>
+        <w:t xml:space="preserve"> </w:t>
+      </w:r>
+      <w:r>
+        <w:tab/>
+      </w:r>
+      <w:r>
+        <w:t xml:space="preserve">2</w:t>
+      </w:r>
+    </w:p>
+    <w:p>
+      <w:pPr>
+        <w:pStyle w:val="TOCEntry1"/>
       </w:pPr>
       <w:r>
         <w:t xml:space="preserve">Conclusion</w:t>
       </w:r>
-    </w:p>
-    <w:p>
-      <w:r>
-        <w:fldChar w:fldCharType="end"/>
+      <w:r>
+        <w:t xml:space="preserve"> </w:t>
+      </w:r>
+      <w:r>
+        <w:tab/>
+      </w:r>
+      <w:r>
+        <w:t xml:space="preserve">3</w:t>
       </w:r>
     </w:p>
     <w:p>
@@ -253,7 +279,7 @@
     </w:p>
     <w:p>
       <w:pPr>
-        <w:pStyle w:val="Hanging"/>
+        <w:pStyle w:val="TOAEntry"/>
       </w:pPr>
       <w:r>
         <w:rPr>
@@ -265,6 +291,15 @@
       <w:r>
         <w:t xml:space="preserve">, 571 U.S. 415 (2014)</w:t>
       </w:r>
+      <w:r>
+        <w:t xml:space="preserve"> </w:t>
+      </w:r>
+      <w:r>
+        <w:tab/>
+      </w:r>
+      <w:r>
+        <w:t xml:space="preserve">2</w:t>
+      </w:r>
     </w:p>
     <w:p>
       <w:pPr>
@@ -280,10 +315,19 @@
     </w:p>
     <w:p>
       <w:pPr>
-        <w:pStyle w:val="Hanging"/>
+        <w:pStyle w:val="TOAEntry"/>
       </w:pPr>
       <w:r>
         <w:t xml:space="preserve">11 U.S.C. § 548</w:t>
+      </w:r>
+      <w:r>
+        <w:t xml:space="preserve"> </w:t>
+      </w:r>
+      <w:r>
+        <w:tab/>
+      </w:r>
+      <w:r>
+        <w:t xml:space="preserve">1</w:t>
       </w:r>
     </w:p>
     <w:p>
@@ -448,7 +492,7 @@
         <w:pStyle w:val="Single"/>
       </w:pPr>
       <w:r>
-        <w:t xml:space="preserve">This brief complies with the typeface and type-style requirements of Fed. R. Bankr. P. 8015(a)(5) and (6) because it has been prepared in a proportionally spaced typeface, 14-point EB Garamond, with plain roman type and italics for emphasis.</w:t>
+        <w:t xml:space="preserve">This brief complies with the typeface and type-style requirements of Fed. R. Bankr. P. 8015(a)(5) and (6) because it has been prepared in a proportionally spaced typeface, 14-point Times New Roman, with plain roman type and italics for emphasis.</w:t>
       </w:r>
     </w:p>
     <w:p>
@@ -588,6 +632,72 @@
 </w:footnotes>
 </file>
 
+<file path=word/ftr-add.xml><?xml version="1.0" encoding="utf-8"?>
+<w:ftr xmlns:w="http://schemas.openxmlformats.org/wordprocessingml/2006/main" xmlns:r="http://schemas.openxmlformats.org/officeDocument/2006/relationships">
+  <w:p>
+    <w:pPr>
+      <w:spacing w:before="0" w:after="0"/>
+      <w:jc w:val="center"/>
+    </w:pPr>
+    <w:r>
+      <w:t>Add-</w:t>
+    </w:r>
+    <w:r>
+      <w:fldChar w:fldCharType="begin"/>
+    </w:r>
+    <w:r>
+      <w:instrText xml:space="preserve"> PAGE </w:instrText>
+    </w:r>
+    <w:r>
+      <w:fldChar w:fldCharType="separate"/>
+    </w:r>
+    <w:r>
+      <w:t>1</w:t>
+    </w:r>
+    <w:r>
+      <w:fldChar w:fldCharType="end"/>
+    </w:r>
+  </w:p>
+</w:ftr>
+</file>
+
+<file path=word/ftr-none.xml><?xml version="1.0" encoding="utf-8"?>
+<w:ftr xmlns:w="http://schemas.openxmlformats.org/wordprocessingml/2006/main" xmlns:r="http://schemas.openxmlformats.org/officeDocument/2006/relationships">
+  <w:p>
+    <w:pPr>
+      <w:spacing w:before="0" w:after="0"/>
+      <w:jc w:val="center"/>
+    </w:pPr>
+  </w:p>
+</w:ftr>
+</file>
+
+<file path=word/ftr-page.xml><?xml version="1.0" encoding="utf-8"?>
+<w:ftr xmlns:w="http://schemas.openxmlformats.org/wordprocessingml/2006/main" xmlns:r="http://schemas.openxmlformats.org/officeDocument/2006/relationships">
+  <w:p>
+    <w:pPr>
+      <w:spacing w:before="0" w:after="0"/>
+      <w:jc w:val="center"/>
+    </w:pPr>
+    <w:r>
+      <w:fldChar w:fldCharType="begin"/>
+    </w:r>
+    <w:r>
+      <w:instrText xml:space="preserve"> PAGE </w:instrText>
+    </w:r>
+    <w:r>
+      <w:fldChar w:fldCharType="separate"/>
+    </w:r>
+    <w:r>
+      <w:t>1</w:t>
+    </w:r>
+    <w:r>
+      <w:fldChar w:fldCharType="end"/>
+    </w:r>
+  </w:p>
+</w:ftr>
+</file>
+
 <file path=word/numbering.xml><?xml version="1.0" encoding="utf-8"?>
 <w:numbering xmlns:w="http://schemas.openxmlformats.org/wordprocessingml/2006/main">
   <w:abstractNum w:abstractNumId="990">
@@ -677,7 +787,7 @@
   <w:docDefaults>
     <w:rPrDefault>
       <w:rPr>
-        <w:rFonts w:ascii="EB Garamond" w:hAnsi="EB Garamond" w:eastAsia="EB Garamond" w:cs="EB Garamond"/>
+        <w:rFonts w:ascii="Times New Roman" w:hAnsi="Times New Roman" w:eastAsia="Times New Roman" w:cs="Times New Roman"/>
         <w:sz w:val="28"/>
         <w:szCs w:val="28"/>
         <w:lang w:val="en-US" w:eastAsia="zh-CN" w:bidi="ar-SA"/>
@@ -1376,6 +1486,38 @@
       <w:ind w:left="576" w:hanging="576"/>
     </w:pPr>
   </w:style>
+  <w:style w:type="paragraph" w:customStyle="1" w:styleId="TOCEntry1">
+    <w:name w:val="TOC Entry 1"/>
+    <w:basedOn w:val="Single"/>
+    <w:qFormat/>
+    <w:pPr>
+      <w:keepLines/>
+      <w:tabs>
+        <w:tab w:val="right" w:leader="dot" w:pos="9340"/>
+      </w:tabs>
+      <w:ind w:left="720" w:right="720" w:hanging="720"/>
+    </w:pPr>
+  </w:style>
+  <w:style w:type="paragraph" w:customStyle="1" w:styleId="TOCEntry2">
+    <w:name w:val="TOC Entry 2"/>
+    <w:basedOn w:val="TOCEntry1"/>
+    <w:qFormat/>
+    <w:pPr>
+      <w:ind w:left="1440" w:right="720" w:hanging="720"/>
+    </w:pPr>
+  </w:style>
+  <w:style w:type="paragraph" w:customStyle="1" w:styleId="TOAEntry">
+    <w:name w:val="TOA Entry"/>
+    <w:basedOn w:val="Hanging"/>
+    <w:qFormat/>
+    <w:pPr>
+      <w:keepLines/>
+      <w:tabs>
+        <w:tab w:val="right" w:leader="dot" w:pos="9340"/>
+      </w:tabs>
+      <w:ind w:left="576" w:right="1120" w:hanging="576"/>
+    </w:pPr>
+  </w:style>
   <w:style w:type="paragraph" w:customStyle="1" w:styleId="TOCLevel2">
     <w:name w:val="TOC Level 2"/>
     <w:basedOn w:val="Single"/>
@@ -1432,8 +1574,18 @@
     <w:basedOn w:val="BodyText"/>
     <w:qFormat/>
   </w:style>
-  <w:style w:type="paragraph" w:customStyle="1" w:styleId="TOCLevel2">
-    <w:name w:val="TOCLevel2"/>
+  <w:style w:type="paragraph" w:customStyle="1" w:styleId="TOAEntry">
+    <w:name w:val="TOAEntry"/>
+    <w:basedOn w:val="BodyText"/>
+    <w:qFormat/>
+  </w:style>
+  <w:style w:type="paragraph" w:customStyle="1" w:styleId="TOCEntry1">
+    <w:name w:val="TOCEntry1"/>
+    <w:basedOn w:val="BodyText"/>
+    <w:qFormat/>
+  </w:style>
+  <w:style w:type="paragraph" w:customStyle="1" w:styleId="TOCEntry2">
+    <w:name w:val="TOCEntry2"/>
     <w:basedOn w:val="BodyText"/>
     <w:qFormat/>
   </w:style>

</xml_diff>